<commit_message>
changes to word document and readme files
</commit_message>
<xml_diff>
--- a/CLDV_ST10481890_POE.docx
+++ b/CLDV_ST10481890_POE.docx
@@ -1164,6 +1164,12 @@
     <w:p>
       <w:r>
         <w:t>YOUTUBE VIDEO:</w:t>
+      </w:r>
+      <w:r>
+        <w:t xml:space="preserve"> </w:t>
+      </w:r>
+      <w:r>
+        <w:t>https://youtu.be/CEzyN3Puvto</w:t>
       </w:r>
     </w:p>
     <w:p>

</xml_diff>

<commit_message>
updates to word document
</commit_message>
<xml_diff>
--- a/CLDV_ST10481890_POE.docx
+++ b/CLDV_ST10481890_POE.docx
@@ -572,7 +572,7 @@
           <w:r>
             <w:fldChar w:fldCharType="separate"/>
           </w:r>
-          <w:hyperlink w:anchor="_Toc227181779" w:history="1">
+          <w:hyperlink w:anchor="_Toc227185055" w:history="1">
             <w:r>
               <w:rPr>
                 <w:rStyle w:val="Hyperlink"/>
@@ -599,7 +599,7 @@
                 <w:noProof/>
                 <w:webHidden/>
               </w:rPr>
-              <w:instrText xml:space="preserve"> PAGEREF _Toc227181779 \h </w:instrText>
+              <w:instrText xml:space="preserve"> PAGEREF _Toc227185055 \h </w:instrText>
             </w:r>
             <w:r>
               <w:rPr>
@@ -642,7 +642,7 @@
               <w:lang w:eastAsia="en-ZA"/>
             </w:rPr>
           </w:pPr>
-          <w:hyperlink w:anchor="_Toc227181780" w:history="1">
+          <w:hyperlink w:anchor="_Toc227185056" w:history="1">
             <w:r>
               <w:rPr>
                 <w:rStyle w:val="Hyperlink"/>
@@ -669,7 +669,7 @@
                 <w:noProof/>
                 <w:webHidden/>
               </w:rPr>
-              <w:instrText xml:space="preserve"> PAGEREF _Toc227181780 \h </w:instrText>
+              <w:instrText xml:space="preserve"> PAGEREF _Toc227185056 \h </w:instrText>
             </w:r>
             <w:r>
               <w:rPr>
@@ -712,7 +712,7 @@
               <w:lang w:eastAsia="en-ZA"/>
             </w:rPr>
           </w:pPr>
-          <w:hyperlink w:anchor="_Toc227181781" w:history="1">
+          <w:hyperlink w:anchor="_Toc227185057" w:history="1">
             <w:r>
               <w:rPr>
                 <w:rStyle w:val="Hyperlink"/>
@@ -739,7 +739,7 @@
                 <w:noProof/>
                 <w:webHidden/>
               </w:rPr>
-              <w:instrText xml:space="preserve"> PAGEREF _Toc227181781 \h </w:instrText>
+              <w:instrText xml:space="preserve"> PAGEREF _Toc227185057 \h </w:instrText>
             </w:r>
             <w:r>
               <w:rPr>
@@ -759,7 +759,7 @@
                 <w:noProof/>
                 <w:webHidden/>
               </w:rPr>
-              <w:t>1</w:t>
+              <w:t>2</w:t>
             </w:r>
             <w:r>
               <w:rPr>
@@ -782,7 +782,7 @@
               <w:lang w:eastAsia="en-ZA"/>
             </w:rPr>
           </w:pPr>
-          <w:hyperlink w:anchor="_Toc227181782" w:history="1">
+          <w:hyperlink w:anchor="_Toc227185058" w:history="1">
             <w:r>
               <w:rPr>
                 <w:rStyle w:val="Hyperlink"/>
@@ -809,7 +809,7 @@
                 <w:noProof/>
                 <w:webHidden/>
               </w:rPr>
-              <w:instrText xml:space="preserve"> PAGEREF _Toc227181782 \h </w:instrText>
+              <w:instrText xml:space="preserve"> PAGEREF _Toc227185058 \h </w:instrText>
             </w:r>
             <w:r>
               <w:rPr>
@@ -829,7 +829,7 @@
                 <w:noProof/>
                 <w:webHidden/>
               </w:rPr>
-              <w:t>1</w:t>
+              <w:t>3</w:t>
             </w:r>
             <w:r>
               <w:rPr>
@@ -852,7 +852,7 @@
               <w:lang w:eastAsia="en-ZA"/>
             </w:rPr>
           </w:pPr>
-          <w:hyperlink w:anchor="_Toc227181783" w:history="1">
+          <w:hyperlink w:anchor="_Toc227185059" w:history="1">
             <w:r>
               <w:rPr>
                 <w:rStyle w:val="Hyperlink"/>
@@ -879,7 +879,7 @@
                 <w:noProof/>
                 <w:webHidden/>
               </w:rPr>
-              <w:instrText xml:space="preserve"> PAGEREF _Toc227181783 \h </w:instrText>
+              <w:instrText xml:space="preserve"> PAGEREF _Toc227185059 \h </w:instrText>
             </w:r>
             <w:r>
               <w:rPr>
@@ -899,7 +899,7 @@
                 <w:noProof/>
                 <w:webHidden/>
               </w:rPr>
-              <w:t>1</w:t>
+              <w:t>3</w:t>
             </w:r>
             <w:r>
               <w:rPr>
@@ -922,7 +922,7 @@
               <w:lang w:eastAsia="en-ZA"/>
             </w:rPr>
           </w:pPr>
-          <w:hyperlink w:anchor="_Toc227181784" w:history="1">
+          <w:hyperlink w:anchor="_Toc227185060" w:history="1">
             <w:r>
               <w:rPr>
                 <w:rStyle w:val="Hyperlink"/>
@@ -949,7 +949,7 @@
                 <w:noProof/>
                 <w:webHidden/>
               </w:rPr>
-              <w:instrText xml:space="preserve"> PAGEREF _Toc227181784 \h </w:instrText>
+              <w:instrText xml:space="preserve"> PAGEREF _Toc227185060 \h </w:instrText>
             </w:r>
             <w:r>
               <w:rPr>
@@ -969,7 +969,7 @@
                 <w:noProof/>
                 <w:webHidden/>
               </w:rPr>
-              <w:t>1</w:t>
+              <w:t>3</w:t>
             </w:r>
             <w:r>
               <w:rPr>
@@ -992,7 +992,7 @@
               <w:lang w:eastAsia="en-ZA"/>
             </w:rPr>
           </w:pPr>
-          <w:hyperlink w:anchor="_Toc227181785" w:history="1">
+          <w:hyperlink w:anchor="_Toc227185061" w:history="1">
             <w:r>
               <w:rPr>
                 <w:rStyle w:val="Hyperlink"/>
@@ -1019,7 +1019,7 @@
                 <w:noProof/>
                 <w:webHidden/>
               </w:rPr>
-              <w:instrText xml:space="preserve"> PAGEREF _Toc227181785 \h </w:instrText>
+              <w:instrText xml:space="preserve"> PAGEREF _Toc227185061 \h </w:instrText>
             </w:r>
             <w:r>
               <w:rPr>
@@ -1039,7 +1039,7 @@
                 <w:noProof/>
                 <w:webHidden/>
               </w:rPr>
-              <w:t>3</w:t>
+              <w:t>4</w:t>
             </w:r>
             <w:r>
               <w:rPr>
@@ -1062,7 +1062,7 @@
               <w:lang w:eastAsia="en-ZA"/>
             </w:rPr>
           </w:pPr>
-          <w:hyperlink w:anchor="_Toc227181786" w:history="1">
+          <w:hyperlink w:anchor="_Toc227185062" w:history="1">
             <w:r>
               <w:rPr>
                 <w:rStyle w:val="Hyperlink"/>
@@ -1089,7 +1089,7 @@
                 <w:noProof/>
                 <w:webHidden/>
               </w:rPr>
-              <w:instrText xml:space="preserve"> PAGEREF _Toc227181786 \h </w:instrText>
+              <w:instrText xml:space="preserve"> PAGEREF _Toc227185062 \h </w:instrText>
             </w:r>
             <w:r>
               <w:rPr>
@@ -1109,7 +1109,7 @@
                 <w:noProof/>
                 <w:webHidden/>
               </w:rPr>
-              <w:t>4</w:t>
+              <w:t>6</w:t>
             </w:r>
             <w:r>
               <w:rPr>
@@ -1176,7 +1176,7 @@
       <w:pPr>
         <w:pStyle w:val="Heading1"/>
       </w:pPr>
-      <w:bookmarkStart w:id="0" w:name="_Toc227181779"/>
+      <w:bookmarkStart w:id="0" w:name="_Toc227185055"/>
       <w:r>
         <w:t>Part 1:</w:t>
       </w:r>
@@ -1186,7 +1186,7 @@
       <w:pPr>
         <w:pStyle w:val="Heading2"/>
       </w:pPr>
-      <w:bookmarkStart w:id="1" w:name="_Toc227181780"/>
+      <w:bookmarkStart w:id="1" w:name="_Toc227185056"/>
       <w:r>
         <w:t>A)</w:t>
       </w:r>
@@ -1235,7 +1235,7 @@
       <w:pPr>
         <w:pStyle w:val="Heading2"/>
       </w:pPr>
-      <w:bookmarkStart w:id="2" w:name="_Toc227181781"/>
+      <w:bookmarkStart w:id="2" w:name="_Toc227185057"/>
       <w:r>
         <w:lastRenderedPageBreak/>
         <w:t>B) (SCREENSHOTS)</w:t>
@@ -1364,7 +1364,7 @@
       <w:pPr>
         <w:pStyle w:val="Heading2"/>
       </w:pPr>
-      <w:bookmarkStart w:id="3" w:name="_Toc227181782"/>
+      <w:bookmarkStart w:id="3" w:name="_Toc227185058"/>
       <w:r>
         <w:t>C) (SCREENSHOTS)</w:t>
       </w:r>
@@ -1374,7 +1374,7 @@
       <w:pPr>
         <w:pStyle w:val="Heading2"/>
       </w:pPr>
-      <w:bookmarkStart w:id="4" w:name="_Toc227181783"/>
+      <w:bookmarkStart w:id="4" w:name="_Toc227185059"/>
       <w:r>
         <w:t>D)</w:t>
       </w:r>
@@ -1384,7 +1384,7 @@
       <w:pPr>
         <w:pStyle w:val="Heading3"/>
       </w:pPr>
-      <w:bookmarkStart w:id="5" w:name="_Toc227181784"/>
+      <w:bookmarkStart w:id="5" w:name="_Toc227185060"/>
       <w:r>
         <w:t>Differences Between Cloud and On-Premises Application Deployment</w:t>
       </w:r>
@@ -1398,6 +1398,38 @@
       <w:r>
         <w:t>When talking about cloud deployment, we mean the installation of software on the cloud-based platform like AWS, Microsoft Azure, or Google Cloud. On-premises deployment occurs when a software program is hosted on the company's physical computers. Both types vary widely in security measures, deployment time, and resource control.</w:t>
       </w:r>
+      <w:sdt>
+        <w:sdtPr>
+          <w:id w:val="-1957937580"/>
+          <w:citation/>
+        </w:sdtPr>
+        <w:sdtContent>
+          <w:r>
+            <w:fldChar w:fldCharType="begin"/>
+          </w:r>
+          <w:r>
+            <w:instrText xml:space="preserve"> CITATION Aar26 \l 7177 </w:instrText>
+          </w:r>
+          <w:r>
+            <w:fldChar w:fldCharType="separate"/>
+          </w:r>
+          <w:r>
+            <w:rPr>
+              <w:noProof/>
+            </w:rPr>
+            <w:t xml:space="preserve"> </w:t>
+          </w:r>
+          <w:r>
+            <w:rPr>
+              <w:noProof/>
+            </w:rPr>
+            <w:t>(Keeports, n.d.)</w:t>
+          </w:r>
+          <w:r>
+            <w:fldChar w:fldCharType="end"/>
+          </w:r>
+        </w:sdtContent>
+      </w:sdt>
     </w:p>
     <w:p>
       <w:pPr>
@@ -1420,7 +1452,15 @@
     </w:p>
     <w:p>
       <w:r>
-        <w:t>In case EventEase uses its bookings stored in Azure's database, the system will have the data encryption feature and role-based access control with MFA</w:t>
+        <w:t xml:space="preserve">In case </w:t>
+      </w:r>
+      <w:proofErr w:type="spellStart"/>
+      <w:r>
+        <w:t>EventEase</w:t>
+      </w:r>
+      <w:proofErr w:type="spellEnd"/>
+      <w:r>
+        <w:t xml:space="preserve"> uses its bookings stored in Azure's database, the system will have the data encryption feature and role-based access control with MFA</w:t>
       </w:r>
       <w:r>
         <w:t xml:space="preserve"> key differences include:</w:t>
@@ -1433,7 +1473,15 @@
     </w:p>
     <w:p>
       <w:r>
-        <w:t>If EventEase chooses to deploy its application on its office server, it needs to install an anti-virus package, configure firewall settings, and take care of backing up the software data</w:t>
+        <w:t xml:space="preserve">If </w:t>
+      </w:r>
+      <w:proofErr w:type="spellStart"/>
+      <w:r>
+        <w:t>EventEase</w:t>
+      </w:r>
+      <w:proofErr w:type="spellEnd"/>
+      <w:r>
+        <w:t xml:space="preserve"> chooses to deploy its application on its office server, it needs to install an anti-virus package, configure firewall settings, and take care of backing up the software data</w:t>
       </w:r>
       <w:r>
         <w:t xml:space="preserve"> key differences include: </w:t>
@@ -1460,7 +1508,15 @@
     </w:p>
     <w:p>
       <w:r>
-        <w:t>suppose EventEase requires another testing server for its developers; then it can be set up easily using Microsoft Azure in a matter of minutes.</w:t>
+        <w:t xml:space="preserve">suppose </w:t>
+      </w:r>
+      <w:proofErr w:type="spellStart"/>
+      <w:r>
+        <w:t>EventEase</w:t>
+      </w:r>
+      <w:proofErr w:type="spellEnd"/>
+      <w:r>
+        <w:t xml:space="preserve"> requires another testing server for its developers; then it can be set up easily using Microsoft Azure in a matter of minutes.</w:t>
       </w:r>
     </w:p>
     <w:p>
@@ -1470,12 +1526,21 @@
     </w:p>
     <w:p>
       <w:r>
-        <w:t>an example of this is if EventEase requires additional server capacity due to heavy traffic; it would require weeks of preparation to deploy a difference between them is that</w:t>
-      </w:r>
-    </w:p>
-    <w:p>
-      <w:r>
-        <w:t>Deployment on cloud services is far faster than deployment on premises</w:t>
+        <w:t xml:space="preserve">an example of this is if </w:t>
+      </w:r>
+      <w:proofErr w:type="spellStart"/>
+      <w:r>
+        <w:t>EventEase</w:t>
+      </w:r>
+      <w:proofErr w:type="spellEnd"/>
+      <w:r>
+        <w:t xml:space="preserve"> requires additional server capacity due to heavy traffic; it would require weeks of preparation to deploy a difference between them is that</w:t>
+      </w:r>
+      <w:r>
+        <w:t xml:space="preserve"> d</w:t>
+      </w:r>
+      <w:r>
+        <w:t>eployment on cloud services is far faster than deployment on premises</w:t>
       </w:r>
     </w:p>
     <w:p>
@@ -1493,7 +1558,15 @@
     </w:p>
     <w:p>
       <w:r>
-        <w:t>If EventEase has too much traffic when customers book holidays, cloud-based servers will scale up to cope with extra traffic and then scale back down.</w:t>
+        <w:t xml:space="preserve">If </w:t>
+      </w:r>
+      <w:proofErr w:type="spellStart"/>
+      <w:r>
+        <w:t>EventEase</w:t>
+      </w:r>
+      <w:proofErr w:type="spellEnd"/>
+      <w:r>
+        <w:t xml:space="preserve"> has too much traffic when customers book holidays, cloud-based servers will scale up to cope with extra traffic and then scale back down.</w:t>
       </w:r>
     </w:p>
     <w:p>
@@ -1503,19 +1576,60 @@
     </w:p>
     <w:p>
       <w:r>
-        <w:t>If EventEase purchases an extra-large server to cope with traffic peaks, the server will remain underutilized during other times while</w:t>
-      </w:r>
-    </w:p>
-    <w:p>
-      <w:r>
-        <w:t>Cloud computing makes use of elastic and efficient resource management</w:t>
-      </w:r>
+        <w:t xml:space="preserve">If </w:t>
+      </w:r>
+      <w:proofErr w:type="spellStart"/>
+      <w:r>
+        <w:t>EventEase</w:t>
+      </w:r>
+      <w:proofErr w:type="spellEnd"/>
+      <w:r>
+        <w:t xml:space="preserve"> purchases an extra-large server to cope with traffic peaks, the server will remain underutilized during other times while</w:t>
+      </w:r>
+      <w:r>
+        <w:t xml:space="preserve"> c</w:t>
+      </w:r>
+      <w:r>
+        <w:t>loud computing makes use of elastic and efficient resource management</w:t>
+      </w:r>
+      <w:sdt>
+        <w:sdtPr>
+          <w:id w:val="1019201662"/>
+          <w:citation/>
+        </w:sdtPr>
+        <w:sdtContent>
+          <w:r>
+            <w:fldChar w:fldCharType="begin"/>
+          </w:r>
+          <w:r>
+            <w:instrText xml:space="preserve"> CITATION Joa26 \l 7177 </w:instrText>
+          </w:r>
+          <w:r>
+            <w:fldChar w:fldCharType="separate"/>
+          </w:r>
+          <w:r>
+            <w:rPr>
+              <w:noProof/>
+            </w:rPr>
+            <w:t xml:space="preserve"> </w:t>
+          </w:r>
+          <w:r>
+            <w:rPr>
+              <w:noProof/>
+            </w:rPr>
+            <w:t>(Krysińska, 2026)</w:t>
+          </w:r>
+          <w:r>
+            <w:fldChar w:fldCharType="end"/>
+          </w:r>
+        </w:sdtContent>
+      </w:sdt>
     </w:p>
     <w:p>
       <w:pPr>
         <w:pStyle w:val="Heading3"/>
       </w:pPr>
-      <w:bookmarkStart w:id="6" w:name="_Toc227181785"/>
+      <w:bookmarkStart w:id="6" w:name="_Toc227185061"/>
       <w:r>
         <w:t>Differences Between IaaS, PaaS, and SaaS</w:t>
       </w:r>
@@ -1679,11 +1793,7 @@
           </w:tcPr>
           <w:p>
             <w:r>
-              <w:t xml:space="preserve">Ready-to-use software accessed </w:t>
-            </w:r>
-            <w:r>
-              <w:lastRenderedPageBreak/>
-              <w:t>through the internet.</w:t>
+              <w:t>Ready-to-use software accessed through the internet.</w:t>
             </w:r>
           </w:p>
         </w:tc>
@@ -1693,7 +1803,6 @@
           </w:tcPr>
           <w:p>
             <w:r>
-              <w:lastRenderedPageBreak/>
               <w:t>Only user settings/data</w:t>
             </w:r>
           </w:p>
@@ -1718,25 +1827,94 @@
     </w:p>
     <w:p>
       <w:r>
-        <w:t>IaaS offers customers the flexibility to configure the operating system, application software, and data on rented virtual resources, which means customers have complete control over how the resources are used. In case EventEase uses an IaaS solution, it will rent virtual machines on platforms such as AWS and Azure and configure the booking system manually. The disadvantage of IaaS solutions is that customers require significant skills in managing computing resources manually, and it requires constant maintenance and upgrades.</w:t>
+        <w:t xml:space="preserve">IaaS offers customers the flexibility to configure the operating system, application software, and data on rented virtual resources, which means customers have complete control over how the resources are used. In case </w:t>
+      </w:r>
+      <w:proofErr w:type="spellStart"/>
+      <w:r>
+        <w:t>EventEase</w:t>
+      </w:r>
+      <w:proofErr w:type="spellEnd"/>
+      <w:r>
+        <w:t xml:space="preserve"> uses an IaaS solution, it will rent virtual machines on platforms such as AWS and Azure and configure the booking system manually. The disadvantage of IaaS solutions is that customers require significant skills in managing computing resources manually, and it requires constant maintenance and upgrades.</w:t>
       </w:r>
     </w:p>
     <w:p>
       <w:r>
-        <w:t>As already mentioned, PaaS entails renting a complete cloud environment for developing and deploying applications. Customers have no control over the infrastructure and operating system. However, they have more control over applications and runtime. It means that EventEase will rent computing resources on a certain platform and upload an application onto it. Using PaaS, customers can focus solely on developing and maintaining applications and do not spend time on maintaining the underlying infrastructure and operating systems. PaaS is a great solution for companies developing custom software.</w:t>
+        <w:t xml:space="preserve">As already mentioned, PaaS entails renting a complete cloud environment for developing and deploying applications. Customers have no control over the infrastructure and operating system. However, they have more control over applications and runtime. It means that </w:t>
+      </w:r>
+      <w:proofErr w:type="spellStart"/>
+      <w:r>
+        <w:t>EventEase</w:t>
+      </w:r>
+      <w:proofErr w:type="spellEnd"/>
+      <w:r>
+        <w:t xml:space="preserve"> will rent computing resources on a certain platform and upload an application onto it. Using PaaS, customers can focus solely on developing and maintaining applications and do not spend time on maintaining the underlying infrastructure and operating systems. PaaS is a great solution for companies developing custom software.</w:t>
       </w:r>
     </w:p>
     <w:p>
       <w:r>
-        <w:t>PaaS is the most suitable solution for EventEase because developers will be able to focus solely on developing and updating software applications without taking care of hardware and infrastructure. Moreover, the platform will enable the company to scale its application quickly when many people try to log in during the holidays. For example, thousands of people will be able to use the application during holidays without any lags or problems. Also, developers will be able to roll out new updates more quickly.</w:t>
+        <w:t xml:space="preserve">PaaS is the most suitable solution for </w:t>
+      </w:r>
+      <w:proofErr w:type="spellStart"/>
+      <w:r>
+        <w:t>EventEase</w:t>
+      </w:r>
+      <w:proofErr w:type="spellEnd"/>
+      <w:r>
+        <w:t xml:space="preserve"> because developers will be able to focus solely on developing and updating software applications without taking care of hardware and infrastructure. Moreover, the platform will enable the company to scale its application quickly when many people try to log in during the holidays. For example, thousands of people will be able to use the application during holidays without any lags or problems. Also, developers will be able to roll out new updates more quickly.</w:t>
       </w:r>
     </w:p>
     <w:p>
       <w:r>
-        <w:t>Additionally, many providers offer built-in services. For instance, developers will not need to implement authentication features for EventEase because the platform will provide a ready-to-use solution. Additionally, EventEase will benefit from the availability of monitoring and analytics built into the platform.</w:t>
-      </w:r>
+        <w:t xml:space="preserve">Additionally, many providers offer built-in services. For instance, developers will not need to implement authentication features for </w:t>
+      </w:r>
+      <w:proofErr w:type="spellStart"/>
+      <w:r>
+        <w:t>EventEase</w:t>
+      </w:r>
+      <w:proofErr w:type="spellEnd"/>
+      <w:r>
+        <w:t xml:space="preserve"> because the platform will provide a ready-to-use solution. Additionally, </w:t>
+      </w:r>
+      <w:proofErr w:type="spellStart"/>
+      <w:r>
+        <w:t>EventEase</w:t>
+      </w:r>
+      <w:proofErr w:type="spellEnd"/>
+      <w:r>
+        <w:t xml:space="preserve"> will benefit from the availability of monitoring and analytics built into the platform.</w:t>
+      </w:r>
+      <w:r>
+        <w:t xml:space="preserve"> </w:t>
+      </w:r>
+      <w:sdt>
+        <w:sdtPr>
+          <w:id w:val="-809859089"/>
+          <w:citation/>
+        </w:sdtPr>
+        <w:sdtContent>
+          <w:r>
+            <w:fldChar w:fldCharType="begin"/>
+          </w:r>
+          <w:r>
+            <w:instrText xml:space="preserve"> CITATION Goo26 \l 7177 </w:instrText>
+          </w:r>
+          <w:r>
+            <w:fldChar w:fldCharType="separate"/>
+          </w:r>
+          <w:r>
+            <w:rPr>
+              <w:noProof/>
+            </w:rPr>
+            <w:t>(Google Cloud, 2026)</w:t>
+          </w:r>
+          <w:r>
+            <w:fldChar w:fldCharType="end"/>
+          </w:r>
+        </w:sdtContent>
+      </w:sdt>
     </w:p>
-    <w:bookmarkStart w:id="7" w:name="_Toc227181786" w:displacedByCustomXml="next"/>
+    <w:bookmarkStart w:id="7" w:name="_Toc227185062" w:displacedByCustomXml="next"/>
     <w:sdt>
       <w:sdtPr>
         <w:id w:val="1862011456"/>
@@ -1770,6 +1948,14 @@
           </w:sdtPr>
           <w:sdtContent>
             <w:p>
+              <w:pPr>
+                <w:pStyle w:val="Bibliography"/>
+                <w:rPr>
+                  <w:noProof/>
+                  <w:kern w:val="0"/>
+                  <w14:ligatures w14:val="none"/>
+                </w:rPr>
+              </w:pPr>
               <w:r>
                 <w:fldChar w:fldCharType="begin"/>
               </w:r>
@@ -1781,13 +1967,145 @@
               </w:r>
               <w:r>
                 <w:rPr>
-                  <w:b/>
-                  <w:bCs/>
                   <w:noProof/>
-                  <w:lang w:val="en-US"/>
                 </w:rPr>
-                <w:t>There are no sources in the current document.</w:t>
+                <w:t xml:space="preserve">Google Cloud, 2026. </w:t>
               </w:r>
+              <w:r>
+                <w:rPr>
+                  <w:i/>
+                  <w:iCs/>
+                  <w:noProof/>
+                </w:rPr>
+                <w:t xml:space="preserve">PaaS vs. IaaS vs. SaaS vs. CaaS: How are they different?. </w:t>
+              </w:r>
+              <w:r>
+                <w:rPr>
+                  <w:noProof/>
+                </w:rPr>
+                <w:t xml:space="preserve">[Online] </w:t>
+              </w:r>
+              <w:r>
+                <w:rPr>
+                  <w:noProof/>
+                </w:rPr>
+                <w:br/>
+                <w:t xml:space="preserve">Available at: </w:t>
+              </w:r>
+              <w:r>
+                <w:rPr>
+                  <w:noProof/>
+                  <w:u w:val="single"/>
+                </w:rPr>
+                <w:t>https://cloud.google.com/learn/paas-vs-iaas-vs-saas</w:t>
+              </w:r>
+              <w:r>
+                <w:rPr>
+                  <w:noProof/>
+                </w:rPr>
+                <w:br/>
+                <w:t>[Accessed 15 04 2026].</w:t>
+              </w:r>
+            </w:p>
+            <w:p>
+              <w:pPr>
+                <w:pStyle w:val="Bibliography"/>
+                <w:rPr>
+                  <w:noProof/>
+                </w:rPr>
+              </w:pPr>
+              <w:r>
+                <w:rPr>
+                  <w:noProof/>
+                </w:rPr>
+                <w:t xml:space="preserve">Keeports, A., n.d. </w:t>
+              </w:r>
+              <w:r>
+                <w:rPr>
+                  <w:i/>
+                  <w:iCs/>
+                  <w:noProof/>
+                </w:rPr>
+                <w:t xml:space="preserve">On Premise vs. Cloud: Key Differences, Benefits and Risks. </w:t>
+              </w:r>
+              <w:r>
+                <w:rPr>
+                  <w:noProof/>
+                </w:rPr>
+                <w:t xml:space="preserve">[Online] </w:t>
+              </w:r>
+              <w:r>
+                <w:rPr>
+                  <w:noProof/>
+                </w:rPr>
+                <w:br/>
+                <w:t xml:space="preserve">Available at: </w:t>
+              </w:r>
+              <w:r>
+                <w:rPr>
+                  <w:noProof/>
+                  <w:u w:val="single"/>
+                </w:rPr>
+                <w:t>https://www.cleo.com/blog/knowledge-base-on-premise-vs-cloud</w:t>
+              </w:r>
+              <w:r>
+                <w:rPr>
+                  <w:noProof/>
+                </w:rPr>
+                <w:br/>
+                <w:t>[Accessed 14 04 2026].</w:t>
+              </w:r>
+            </w:p>
+            <w:p>
+              <w:pPr>
+                <w:pStyle w:val="Bibliography"/>
+                <w:rPr>
+                  <w:noProof/>
+                </w:rPr>
+              </w:pPr>
+              <w:r>
+                <w:rPr>
+                  <w:noProof/>
+                </w:rPr>
+                <w:t xml:space="preserve">Krysińska, J., 2026. </w:t>
+              </w:r>
+              <w:r>
+                <w:rPr>
+                  <w:i/>
+                  <w:iCs/>
+                  <w:noProof/>
+                </w:rPr>
+                <w:t xml:space="preserve">On-premise vs. cloud: main differences. </w:t>
+              </w:r>
+              <w:r>
+                <w:rPr>
+                  <w:noProof/>
+                </w:rPr>
+                <w:t xml:space="preserve">[Online] </w:t>
+              </w:r>
+              <w:r>
+                <w:rPr>
+                  <w:noProof/>
+                </w:rPr>
+                <w:br/>
+                <w:t xml:space="preserve">Available at: </w:t>
+              </w:r>
+              <w:r>
+                <w:rPr>
+                  <w:noProof/>
+                  <w:u w:val="single"/>
+                </w:rPr>
+                <w:t>https://nordlayer.com/blog/on-premise-vs-cloud-differences/</w:t>
+              </w:r>
+              <w:r>
+                <w:rPr>
+                  <w:noProof/>
+                </w:rPr>
+                <w:br/>
+                <w:t>[Accessed 15 04 2026].</w:t>
+              </w:r>
+            </w:p>
+            <w:p>
               <w:r>
                 <w:rPr>
                   <w:b/>
@@ -2978,6 +3296,14 @@
       <w:shd w:val="clear" w:color="auto" w:fill="E1DFDD"/>
     </w:rPr>
   </w:style>
+  <w:style w:type="paragraph" w:styleId="Bibliography">
+    <w:name w:val="Bibliography"/>
+    <w:basedOn w:val="Normal"/>
+    <w:next w:val="Normal"/>
+    <w:uiPriority w:val="37"/>
+    <w:unhideWhenUsed/>
+    <w:rsid w:val="00A743DC"/>
+  </w:style>
 </w:styles>
 </file>
 
@@ -3297,11 +3623,72 @@
 </file>
 
 <file path=customXml/item1.xml><?xml version="1.0" encoding="utf-8"?>
-<b:Sources xmlns:b="http://schemas.openxmlformats.org/officeDocument/2006/bibliography" xmlns="http://schemas.openxmlformats.org/officeDocument/2006/bibliography" SelectedStyle="\HarvardAnglia2008OfficeOnline.xsl" StyleName="Harvard - Anglia" Version="2008"/>
+<b:Sources xmlns:b="http://schemas.openxmlformats.org/officeDocument/2006/bibliography" xmlns="http://schemas.openxmlformats.org/officeDocument/2006/bibliography" SelectedStyle="\HarvardAnglia2008OfficeOnline.xsl" StyleName="Harvard - Anglia" Version="2008">
+  <b:Source>
+    <b:Tag>Aar26</b:Tag>
+    <b:SourceType>InternetSite</b:SourceType>
+    <b:Guid>{86AABCE8-2151-45BA-8B87-9E5E7B7C1D1B}</b:Guid>
+    <b:Author>
+      <b:Author>
+        <b:NameList>
+          <b:Person>
+            <b:Last>Keeports</b:Last>
+            <b:First>Aaron</b:First>
+          </b:Person>
+        </b:NameList>
+      </b:Author>
+    </b:Author>
+    <b:Title>On Premise vs. Cloud: Key Differences, Benefits and Risks</b:Title>
+    <b:YearAccessed>2026</b:YearAccessed>
+    <b:MonthAccessed>04</b:MonthAccessed>
+    <b:DayAccessed>14</b:DayAccessed>
+    <b:URL>https://www.cleo.com/blog/knowledge-base-on-premise-vs-cloud</b:URL>
+    <b:RefOrder>1</b:RefOrder>
+  </b:Source>
+  <b:Source>
+    <b:Tag>Joa26</b:Tag>
+    <b:SourceType>InternetSite</b:SourceType>
+    <b:Guid>{6D661564-1831-48FF-979A-19FEE00673ED}</b:Guid>
+    <b:Author>
+      <b:Author>
+        <b:NameList>
+          <b:Person>
+            <b:Last>Krysińska</b:Last>
+            <b:First>Joanna</b:First>
+          </b:Person>
+        </b:NameList>
+      </b:Author>
+    </b:Author>
+    <b:Title>On-premise vs. cloud: main differences</b:Title>
+    <b:Year>2026</b:Year>
+    <b:YearAccessed>2026</b:YearAccessed>
+    <b:MonthAccessed>04</b:MonthAccessed>
+    <b:DayAccessed>15</b:DayAccessed>
+    <b:URL>https://nordlayer.com/blog/on-premise-vs-cloud-differences/</b:URL>
+    <b:RefOrder>2</b:RefOrder>
+  </b:Source>
+  <b:Source>
+    <b:Tag>Goo26</b:Tag>
+    <b:SourceType>InternetSite</b:SourceType>
+    <b:Guid>{BD6498B7-E4C9-46B9-98FA-DEEC582DB9B3}</b:Guid>
+    <b:Author>
+      <b:Author>
+        <b:Corporate>Google Cloud</b:Corporate>
+      </b:Author>
+    </b:Author>
+    <b:Title>PaaS vs. IaaS vs. SaaS vs. CaaS: How are they different?</b:Title>
+    <b:Year>2026</b:Year>
+    <b:YearAccessed>2026</b:YearAccessed>
+    <b:MonthAccessed>04</b:MonthAccessed>
+    <b:DayAccessed>15</b:DayAccessed>
+    <b:URL>https://cloud.google.com/learn/paas-vs-iaas-vs-saas</b:URL>
+    <b:RefOrder>3</b:RefOrder>
+  </b:Source>
+</b:Sources>
 </file>
 
 <file path=customXml/itemProps1.xml><?xml version="1.0" encoding="utf-8"?>
-<ds:datastoreItem xmlns:ds="http://schemas.openxmlformats.org/officeDocument/2006/customXml" ds:itemID="{84CDD4B5-C2A6-40D9-8117-E6E2B1A12A76}">
+<ds:datastoreItem xmlns:ds="http://schemas.openxmlformats.org/officeDocument/2006/customXml" ds:itemID="{107C9E22-6149-4DEE-8E9A-4C9D30AD7040}">
   <ds:schemaRefs>
     <ds:schemaRef ds:uri="http://schemas.openxmlformats.org/officeDocument/2006/bibliography"/>
   </ds:schemaRefs>

</xml_diff>